<commit_message>
PDF and export fixes
</commit_message>
<xml_diff>
--- a/templates/einwilligungserklaerung.docx
+++ b/templates/einwilligungserklaerung.docx
@@ -477,6 +477,9 @@
                 <w:szCs w:val="21"/>
               </w:rPr>
             </w:pPr>
+            <w:r>
+              <w:t xml:space="preserve">{ANSCHLUSSNUTZER_NAME}</w:t>
+            </w:r>
             <w:r>
               <w:rPr>
                 <w:rFonts w:cstheme="minorHAnsi"/>
@@ -667,6 +670,9 @@
               </w:rPr>
             </w:pPr>
             <w:r>
+              <w:t xml:space="preserve">{ANSCHLUSSNUTZER_STRASSE}</w:t>
+            </w:r>
+            <w:r>
               <w:rPr>
                 <w:rFonts w:cstheme="minorHAnsi"/>
                 <w:color w:val="000000"/>
@@ -742,6 +748,9 @@
                 <w:szCs w:val="21"/>
               </w:rPr>
             </w:pPr>
+            <w:r>
+              <w:t xml:space="preserve">{ANSCHLUSSNUTZER_PLZ_ORT}</w:t>
+            </w:r>
             <w:r>
               <w:rPr>
                 <w:rFonts w:cstheme="minorHAnsi"/>
@@ -994,6 +1003,9 @@
                 <w:szCs w:val="21"/>
               </w:rPr>
             </w:pPr>
+            <w:r>
+              <w:t xml:space="preserve">{ESA_NAME}</w:t>
+            </w:r>
           </w:p>
         </w:tc>
       </w:tr>
@@ -1087,6 +1099,9 @@
                 <w:szCs w:val="21"/>
               </w:rPr>
             </w:pPr>
+            <w:r>
+              <w:t xml:space="preserve">{ESA_STRASSE}</w:t>
+            </w:r>
             <w:r>
               <w:rPr>
                 <w:rFonts w:cstheme="minorHAnsi"/>
@@ -1189,6 +1204,9 @@
                 <w:szCs w:val="21"/>
               </w:rPr>
             </w:pPr>
+            <w:r>
+              <w:t xml:space="preserve">{ESA_PLZ_ORT}</w:t>
+            </w:r>
             <w:r>
               <w:rPr>
                 <w:rFonts w:cstheme="minorHAnsi"/>
@@ -1319,23 +1337,7 @@
               </w:rPr>
             </w:pPr>
             <w:r>
-              <w:rPr>
-                <w:rFonts w:cstheme="minorHAnsi"/>
-                <w:color w:val="000000"/>
-                <w:sz w:val="21"/>
-                <w:szCs w:val="21"/>
-              </w:rPr>
-              <w:t> </w:t>
-            </w:r>
-            <w:r>
-              <w:rPr>
-                <w:rFonts w:cstheme="minorHAnsi"/>
-                <w:i/>
-                <w:iCs/>
-                <w:sz w:val="21"/>
-                <w:szCs w:val="21"/>
-              </w:rPr>
-              <w:t xml:space="preserve"> (13-stellig)</w:t>
+              <w:t xml:space="preserve">{ESA_MARKTPARTNER_ID}</w:t>
             </w:r>
           </w:p>
         </w:tc>
@@ -1554,6 +1556,9 @@
                 <w:szCs w:val="21"/>
               </w:rPr>
             </w:pPr>
+            <w:r>
+              <w:t xml:space="preserve">{MSB_NAME}</w:t>
+            </w:r>
           </w:p>
         </w:tc>
       </w:tr>
@@ -1639,6 +1644,9 @@
                 <w:szCs w:val="21"/>
               </w:rPr>
             </w:pPr>
+            <w:r>
+              <w:t xml:space="preserve">{MSB_STRASSE}</w:t>
+            </w:r>
             <w:r>
               <w:rPr>
                 <w:rFonts w:cstheme="minorHAnsi"/>
@@ -1733,6 +1741,9 @@
                 <w:szCs w:val="21"/>
               </w:rPr>
             </w:pPr>
+            <w:r>
+              <w:t xml:space="preserve">{MSB_PLZ_ORT}</w:t>
+            </w:r>
             <w:r>
               <w:rPr>
                 <w:rFonts w:cstheme="minorHAnsi"/>
@@ -1846,24 +1857,7 @@
               </w:rPr>
             </w:pPr>
             <w:r>
-              <w:rPr>
-                <w:rFonts w:cstheme="minorHAnsi"/>
-                <w:color w:val="000000"/>
-                <w:sz w:val="21"/>
-                <w:szCs w:val="21"/>
-              </w:rPr>
-              <w:t> </w:t>
-            </w:r>
-            <w:r>
-              <w:rPr>
-                <w:rFonts w:cstheme="minorHAnsi"/>
-                <w:i/>
-                <w:iCs/>
-                <w:color w:val="000000"/>
-                <w:sz w:val="21"/>
-                <w:szCs w:val="21"/>
-              </w:rPr>
-              <w:t xml:space="preserve"> (13-stellig)</w:t>
+              <w:t xml:space="preserve">{MSB_CODE_NR}</w:t>
             </w:r>
           </w:p>
         </w:tc>
@@ -2007,49 +2001,7 @@
               </w:rPr>
             </w:pPr>
             <w:r>
-              <w:rPr>
-                <w:rFonts w:cstheme="minorHAnsi"/>
-                <w:color w:val="000000"/>
-                <w:sz w:val="21"/>
-                <w:szCs w:val="21"/>
-              </w:rPr>
-              <w:t>TT</w:t>
-            </w:r>
-            <w:r>
-              <w:rPr>
-                <w:rFonts w:cstheme="minorHAnsi"/>
-                <w:color w:val="000000"/>
-                <w:sz w:val="21"/>
-                <w:szCs w:val="21"/>
-              </w:rPr>
-              <w:t>.</w:t>
-            </w:r>
-            <w:r>
-              <w:rPr>
-                <w:rFonts w:cstheme="minorHAnsi"/>
-                <w:color w:val="000000"/>
-                <w:sz w:val="21"/>
-                <w:szCs w:val="21"/>
-              </w:rPr>
-              <w:t>MM</w:t>
-            </w:r>
-            <w:r>
-              <w:rPr>
-                <w:rFonts w:cstheme="minorHAnsi"/>
-                <w:color w:val="000000"/>
-                <w:sz w:val="21"/>
-                <w:szCs w:val="21"/>
-              </w:rPr>
-              <w:t>.</w:t>
-            </w:r>
-            <w:r>
-              <w:rPr>
-                <w:rFonts w:cstheme="minorHAnsi"/>
-                <w:color w:val="000000"/>
-                <w:sz w:val="21"/>
-                <w:szCs w:val="21"/>
-              </w:rPr>
-              <w:t>JJJJ</w:t>
+              <w:t xml:space="preserve">{BEGINN_DATUM}</w:t>
             </w:r>
           </w:p>
         </w:tc>
@@ -2113,13 +2065,7 @@
               </w:rPr>
             </w:pPr>
             <w:r>
-              <w:rPr>
-                <w:rFonts w:cstheme="minorHAnsi"/>
-                <w:color w:val="000000"/>
-                <w:sz w:val="21"/>
-                <w:szCs w:val="21"/>
-              </w:rPr>
-              <w:t>TT.MM.JJJJ</w:t>
+              <w:t xml:space="preserve">{ENDE_DATUM}</w:t>
             </w:r>
           </w:p>
         </w:tc>
@@ -2609,15 +2555,7 @@
               </w:rPr>
             </w:pPr>
             <w:r>
-              <w:rPr>
-                <w:rFonts w:cstheme="minorBidi"/>
-                <w:b/>
-                <w:bCs/>
-                <w:color w:val="000000" w:themeColor="text2"/>
-                <w:sz w:val="21"/>
-                <w:szCs w:val="21"/>
-              </w:rPr>
-              <w:t>*</w:t>
+              <w:t xml:space="preserve">{#MESSPRODUKTEN}{CODE}</w:t>
             </w:r>
           </w:p>
         </w:tc>
@@ -2665,90 +2603,9 @@
                 <w:szCs w:val="21"/>
               </w:rPr>
             </w:pPr>
-          </w:p>
-        </w:tc>
-      </w:tr>
-      <w:tr>
-        <w:trPr>
-          <w:trHeight w:val="288"/>
-          <w:tblHeader/>
-        </w:trPr>
-        <w:tc>
-          <w:tcPr>
-            <w:tcW w:w="1843" w:type="dxa"/>
-            <w:tcBorders>
-              <w:top w:val="single" w:sz="4" w:space="0" w:color="auto"/>
-              <w:left w:val="single" w:sz="4" w:space="0" w:color="auto"/>
-              <w:bottom w:val="single" w:sz="4" w:space="0" w:color="auto"/>
-              <w:right w:val="single" w:sz="4" w:space="0" w:color="auto"/>
-            </w:tcBorders>
-            <w:shd w:val="clear" w:color="auto" w:fill="FFFFFF" w:themeFill="background1"/>
-            <w:noWrap/>
-          </w:tcPr>
-          <w:p>
-            <w:pPr>
-              <w:spacing w:after="0" w:line="240" w:lineRule="auto"/>
-              <w:rPr>
-                <w:rFonts w:cstheme="minorHAnsi"/>
-                <w:color w:val="000000"/>
-                <w:sz w:val="21"/>
-                <w:szCs w:val="21"/>
-              </w:rPr>
-            </w:pPr>
             <w:r>
-              <w:rPr>
-                <w:rFonts w:cstheme="minorBidi"/>
-                <w:sz w:val="21"/>
-                <w:szCs w:val="21"/>
-              </w:rPr>
-              <w:t>…</w:t>
+              <w:t xml:space="preserve">{BEZEICHNUNG}{/MESSPRODUKTEN}</w:t>
             </w:r>
-          </w:p>
-        </w:tc>
-        <w:tc>
-          <w:tcPr>
-            <w:tcW w:w="6379" w:type="dxa"/>
-            <w:tcBorders>
-              <w:top w:val="single" w:sz="4" w:space="0" w:color="auto"/>
-              <w:left w:val="single" w:sz="4" w:space="0" w:color="auto"/>
-              <w:bottom w:val="single" w:sz="4" w:space="0" w:color="auto"/>
-              <w:right w:val="single" w:sz="4" w:space="0" w:color="auto"/>
-            </w:tcBorders>
-            <w:shd w:val="clear" w:color="auto" w:fill="FFFFFF" w:themeFill="background1"/>
-          </w:tcPr>
-          <w:p>
-            <w:pPr>
-              <w:spacing w:after="0" w:line="240" w:lineRule="auto"/>
-              <w:rPr>
-                <w:rFonts w:cstheme="minorHAnsi"/>
-                <w:color w:val="000000"/>
-                <w:sz w:val="21"/>
-                <w:szCs w:val="21"/>
-              </w:rPr>
-            </w:pPr>
-          </w:p>
-        </w:tc>
-        <w:tc>
-          <w:tcPr>
-            <w:tcW w:w="567" w:type="dxa"/>
-            <w:tcBorders>
-              <w:top w:val="single" w:sz="4" w:space="0" w:color="auto"/>
-              <w:left w:val="single" w:sz="4" w:space="0" w:color="auto"/>
-              <w:bottom w:val="single" w:sz="4" w:space="0" w:color="auto"/>
-              <w:right w:val="single" w:sz="4" w:space="0" w:color="000000"/>
-            </w:tcBorders>
-            <w:shd w:val="clear" w:color="auto" w:fill="FFFFFF" w:themeFill="background1"/>
-          </w:tcPr>
-          <w:p>
-            <w:pPr>
-              <w:spacing w:after="0" w:line="240" w:lineRule="auto"/>
-              <w:jc w:val="center"/>
-              <w:rPr>
-                <w:rFonts w:eastAsia="MS Gothic" w:cstheme="minorHAnsi"/>
-                <w:sz w:val="21"/>
-                <w:szCs w:val="21"/>
-              </w:rPr>
-            </w:pPr>
           </w:p>
         </w:tc>
       </w:tr>

</xml_diff>